<commit_message>
Redraft the manuscript for shorter sentences and plainer flow
The main text fell from 3,054 to 2,719 words and the abstract from 245 to 218.
Sentences averaged 28 words, against 36 before. Secondary error statistics were
left to Table 4, and the review criteria and available-forest rules became
numbered lists in Methods. No number, citation or quotation was changed.
</commit_message>
<xml_diff>
--- a/01.manuscript/lidar-marbled-murrelet.docx
+++ b/01.manuscript/lidar-marbled-murrelet.docx
@@ -40,7 +40,7 @@
         <w:pStyle w:val="FirstParagraph"/>
       </w:pPr>
       <w:r>
-        <w:t xml:space="preserve">By 2019, provincial airborne laser scanning had measured old-growth forest structure along much of the British Columbia coast, but the one Marbled Murrelet nesting-habitat model built from such scans and located nests, trained in Desolation Sound, lost accuracy when moved to Clayoquot Sound, and whether a model built from local nests would do better was unknown. This study rebuilt that model, maximum entropy modeling of forest vertical complexity and internal forest gaps in 1 ha cells, in Clayoquot Sound from the 2019 scans and the nests of birds radio-tracked from 2000 to 2002 (16 nest cells and 3,827 background cells in scanned, tall, unharvested forest), and scored it by five-fold spatial cross-validation in 10 km blocks. Neither measure separated nest cells from background cells (forest vertical complexity,</w:t>
+        <w:t xml:space="preserve">Provincial airborne laser scans flown in 2019 measured old-growth forest structure across Clayoquot Sound, British Columbia, but the only Marbled Murrelet nesting-habitat model built from such scans and located nests, trained in Desolation Sound, lost accuracy when transferred there. Whether a model built from Clayoquot Sound’s own nests would do better was unknown. This study rebuilt that model from the 2019 scans and the nests of birds radio-tracked from 2000 to 2002 (16 nest cells and 3,827 background cells of 1 ha in tall, unharvested forest). Maximum entropy modeling of forest vertical complexity and internal forest gaps was scored by five-fold spatial cross-validation in 10 km blocks. Neither measure separated nest cells from background cells (forest vertical complexity,</w:t>
       </w:r>
       <w:r>
         <w:t xml:space="preserve"> </w:t>
@@ -72,7 +72,7 @@
         <w:t xml:space="preserve"> </w:t>
       </w:r>
       <w:r>
-        <w:t xml:space="preserve">= 0.10), and nest cells held more internal gaps than background cells, the reverse of the direction found in Desolation Sound. At each fold’s threshold the model classed 62.5 percent of held-out nest cells and 40.8 percent of background cells correctly, an average accuracy of 51.7 percent, no better than chance, and its ranking of nest cells could not be shown to differ from that of the model transferred from Desolation Sound. With so few located nests, open laser scans did not support a local nesting-habitat model in Clayoquot Sound, and the transferred model, or one fitted to nests pooled across regions, offered the better-supported basis for mapping nesting habitat there.</w:t>
+        <w:t xml:space="preserve">= 0.10), and nest cells had more internal gaps than background cells, the reverse of the Desolation Sound relation. The model classed 62.5 percent of held-out nest cells and 40.8 percent of background cells correctly, an average accuracy of 51.7 percent and no better than chance. Its ranking of nest cells could not be shown to differ from that of the model transferred from Desolation Sound. With so few located nests, the transferred model, or one fitted to nests pooled across regions, remained the better-supported basis for mapping nesting habitat in Clayoquot Sound.</w:t>
       </w:r>
     </w:p>
     <w:bookmarkEnd w:id="20"/>
@@ -137,7 +137,7 @@
         <w:t xml:space="preserve"> </w:t>
       </w:r>
       <w:r>
-        <w:t xml:space="preserve">(Gmelin, 1789), a seabird that commutes between the ocean and nest sites inland in old-growth coniferous forest, was listed as threatened in both Canada and the United States, and loss of that forest was the primary reason given for its decline</w:t>
+        <w:t xml:space="preserve">(Gmelin, 1789), is a seabird that nests inland in old-growth coniferous forest. It was listed as threatened in Canada and the United States, and loss of that forest was the primary reason given for its decline</w:t>
       </w:r>
       <w:r>
         <w:t xml:space="preserve"> </w:t>
@@ -146,7 +146,7 @@
         <w:t xml:space="preserve">(Burger, 2001)</w:t>
       </w:r>
       <w:r>
-        <w:t xml:space="preserve">. Because nests were cryptic and difficult to locate</w:t>
+        <w:t xml:space="preserve">. Because its nests were cryptic and difficult to locate</w:t>
       </w:r>
       <w:r>
         <w:t xml:space="preserve"> </w:t>
@@ -155,7 +155,7 @@
         <w:t xml:space="preserve">(Burger, 2001)</w:t>
       </w:r>
       <w:r>
-        <w:t xml:space="preserve">, the nesting habitat that conservation planning in British Columbia set out to retain was mapped from forest inventory, air photographs and aerial surveys, and then judged against the few nests that radio telemetry had found</w:t>
+        <w:t xml:space="preserve">, the nesting habitat retained for it in British Columbia was mapped from forest inventory, air photographs and aerial surveys and judged against the few nests found by radio telemetry</w:t>
       </w:r>
       <w:r>
         <w:t xml:space="preserve"> </w:t>
@@ -172,7 +172,7 @@
         <w:pStyle w:val="BodyText"/>
       </w:pPr>
       <w:r>
-        <w:t xml:space="preserve">In British Columbia the provincial habitat model classed forest-cover polygons as suitable where stands were older than 140 years, at least 28.5 m tall, below set elevations and within 50 km of the sea</w:t>
+        <w:t xml:space="preserve">The provincial habitat model classed forest-cover polygons as suitable by stand age, height, elevation and distance to the sea</w:t>
       </w:r>
       <w:r>
         <w:t xml:space="preserve"> </w:t>
@@ -181,16 +181,7 @@
         <w:t xml:space="preserve">(Mather et al., 2010)</w:t>
       </w:r>
       <w:r>
-        <w:t xml:space="preserve">, while air photo interpretation and low-level aerial surveys ranked stands from canopy features seen from above</w:t>
-      </w:r>
-      <w:r>
-        <w:t xml:space="preserve"> </w:t>
-      </w:r>
-      <w:r>
-        <w:t xml:space="preserve">(Burger et al., 2009; Waterhouse et al., 2009, 2008)</w:t>
-      </w:r>
-      <w:r>
-        <w:t xml:space="preserve">. Overlaid on 171 nests found by radio telemetry in four regions, the provincial model placed 52.6 percent of nests in suitable habitat, 69.4 percent of 36 nests in Clayoquot Sound and 52.1 percent of 121 nests in Desolation Sound</w:t>
+        <w:t xml:space="preserve">. Against 171 radio-tracked nests, it placed 52.6 percent in suitable habitat, 69.4 percent in Clayoquot Sound and 52.1 percent in Desolation Sound</w:t>
       </w:r>
       <w:r>
         <w:t xml:space="preserve"> </w:t>
@@ -199,7 +190,16 @@
         <w:t xml:space="preserve">(Burger et al., 2018)</w:t>
       </w:r>
       <w:r>
-        <w:t xml:space="preserve">. The aerial survey ranks separated nests from random points in Desolation Sound and Toba Inlet but not in Clayoquot Sound</w:t>
+        <w:t xml:space="preserve">. Air photo interpretation and low-level aerial surveys ranked stands by canopy features seen from above</w:t>
+      </w:r>
+      <w:r>
+        <w:t xml:space="preserve"> </w:t>
+      </w:r>
+      <w:r>
+        <w:t xml:space="preserve">(Burger et al., 2009; Waterhouse et al., 2008)</w:t>
+      </w:r>
+      <w:r>
+        <w:t xml:space="preserve">, and the survey ranks separated nests from random points in Desolation Sound and Toba Inlet but not in Clayoquot Sound</w:t>
       </w:r>
       <w:r>
         <w:t xml:space="preserve"> </w:t>
@@ -208,7 +208,7 @@
         <w:t xml:space="preserve">(Waterhouse et al., 2009)</w:t>
       </w:r>
       <w:r>
-        <w:t xml:space="preserve">, and all three methods inferred forest structure from maps or from observers’ ranks rather than measuring it.</w:t>
+        <w:t xml:space="preserve">. All of these methods inferred forest structure from maps or from observers’ ranks rather than measuring it.</w:t>
       </w:r>
     </w:p>
     <w:p>
@@ -216,7 +216,7 @@
         <w:pStyle w:val="BodyText"/>
       </w:pPr>
       <w:r>
-        <w:t xml:space="preserve">Airborne laser scanning measured canopy height and the vertical arrangement of vegetation directly, and murrelet habitat models built from it scored well against survey data. In southwestern Oregon a lidar model of stand occupancy reached an area under the receiver operating characteristic curve (AUC) of 0.74, against 0.64 for a model built from vegetation maps, and two lidar measures separated 11 nest trees from random points with an average AUC of 0.91</w:t>
+        <w:t xml:space="preserve">Airborne laser scanning measured canopy height and the vertical arrangement of vegetation directly, and murrelet models built from it scored well against survey data. In southwestern Oregon, a lidar model of stand occupancy reached an area under the receiver operating characteristic curve (AUC), on which 0.5 marks chance, of 0.74, against 0.64 for a model built from vegetation maps</w:t>
       </w:r>
       <w:r>
         <w:t xml:space="preserve"> </w:t>
@@ -225,7 +225,7 @@
         <w:t xml:space="preserve">(Hagar et al., 2014)</w:t>
       </w:r>
       <w:r>
-        <w:t xml:space="preserve">. In redwood timberland in northern California, habitat suitability rose with the density, summed height and spread of heights of tall treetops</w:t>
+        <w:t xml:space="preserve">. Laser-scan measures of tall treetops predicted habitat suitability in redwood timberland in northern California</w:t>
       </w:r>
       <w:r>
         <w:t xml:space="preserve"> </w:t>
@@ -234,7 +234,7 @@
         <w:t xml:space="preserve">(Lamphear et al., 2025)</w:t>
       </w:r>
       <w:r>
-        <w:t xml:space="preserve">, and on northern Vancouver Island a random forest predicted helicopter survey ranks from laser-derived canopy and terrain measures with an overall accuracy of 71.05 percent</w:t>
+        <w:t xml:space="preserve">, and canopy and terrain measures predicted helicopter survey ranks on northern Vancouver Island with an overall accuracy of 71.05 percent</w:t>
       </w:r>
       <w:r>
         <w:t xml:space="preserve"> </w:t>
@@ -243,19 +243,7 @@
         <w:t xml:space="preserve">(Clyde, 2017)</w:t>
       </w:r>
       <w:r>
-        <w:t xml:space="preserve">. Among the studies reviewed here, Cosgrove et al.</w:t>
-      </w:r>
-      <w:r>
-        <w:t xml:space="preserve"> </w:t>
-      </w:r>
-      <w:r>
-        <w:t xml:space="preserve">(2024)</w:t>
-      </w:r>
-      <w:r>
-        <w:t xml:space="preserve"> </w:t>
-      </w:r>
-      <w:r>
-        <w:t xml:space="preserve">were the first to train a laser-scan model on located nests in British Columbia, fitting maximum entropy modeling (MaxEnt) to radio-tracked nests in Desolation Sound in 1 ha cells. The probability of a nest in their model rose with forest vertical complexity and fell as internal forest gaps increased, and the model scored an AUC of 0.77 and a Boyce index, a measure of how closely predicted suitability tracked the frequency of nests, of 0.99 in Desolation Sound.</w:t>
+        <w:t xml:space="preserve">.</w:t>
       </w:r>
     </w:p>
     <w:p>
@@ -263,7 +251,7 @@
         <w:pStyle w:val="BodyText"/>
       </w:pPr>
       <w:r>
-        <w:t xml:space="preserve">Transferred to Clayoquot Sound, where it would have to hold to be of use to management, the Desolation Sound model of Cosgrove et al.</w:t>
+        <w:t xml:space="preserve">Among the studies reviewed here, Cosgrove et al.</w:t>
       </w:r>
       <w:r>
         <w:t xml:space="preserve"> </w:t>
@@ -275,7 +263,7 @@
         <w:t xml:space="preserve"> </w:t>
       </w:r>
       <w:r>
-        <w:t xml:space="preserve">scored an AUC of 0.63 and a Boyce index of 0.67, below the AUC of 0.7 those authors set for a good model. In Oregon, an occupancy model transferred from the Coos Bay District to the Siuslaw National Forest scored an AUC of 0.73, against 0.78 for a model selected from Siuslaw data</w:t>
+        <w:t xml:space="preserve">were the first to train a laser-scan model on located nests in British Columbia, fitting maximum entropy modeling (MaxEnt) to radio-tracked nests in Desolation Sound in 1 ha cells. Predicted suitability rose with forest vertical complexity, the spread of point heights, and fell with internal forest gaps, the empty space below the top of the canopy. The model scored an AUC of 0.77 and a Boyce index, a measure of how closely predicted suitability tracked nest frequency, of 0.99 in Desolation Sound. Transferred to Clayoquot Sound, it scored 0.63 and 0.67, below the AUC of 0.7 those authors set for a good model. In Oregon, a lidar occupancy model transferred from the Coos Bay District to the Siuslaw National Forest scored an AUC of 0.73, against 0.78 for a model selected from Siuslaw data</w:t>
       </w:r>
       <w:r>
         <w:t xml:space="preserve"> </w:t>
@@ -284,7 +272,19 @@
         <w:t xml:space="preserve">(Hagar et al., 2018)</w:t>
       </w:r>
       <w:r>
-        <w:t xml:space="preserve">. In southern British Columbia, ground plots at radio-tracked nests showed canopy height and canopy complexity relating to nest sites in opposite directions in the two sounds, Clayoquot Sound nest patches being shorter and less varied than random patches, and the authors judged that</w:t>
+        <w:t xml:space="preserve">. In the two sounds, ground plots at radio-tracked nests showed canopy height and complexity relating to nest sites in opposite directions, and Silvergieter and Lank</w:t>
+      </w:r>
+      <w:r>
+        <w:t xml:space="preserve"> </w:t>
+      </w:r>
+      <w:r>
+        <w:t xml:space="preserve">(2011a, p. 11)</w:t>
+      </w:r>
+      <w:r>
+        <w:t xml:space="preserve"> </w:t>
+      </w:r>
+      <w:r>
+        <w:t xml:space="preserve">judged that</w:t>
       </w:r>
       <w:r>
         <w:t xml:space="preserve"> </w:t>
@@ -296,16 +296,7 @@
         <w:t xml:space="preserve"> </w:t>
       </w:r>
       <w:r>
-        <w:t xml:space="preserve">testing Desolation Sound models against Clayoquot Sound nests</w:t>
-      </w:r>
-      <w:r>
-        <w:t xml:space="preserve"> </w:t>
-      </w:r>
-      <w:r>
-        <w:t xml:space="preserve">(Silvergieter and Lank, 2011a, p. 11)</w:t>
-      </w:r>
-      <w:r>
-        <w:t xml:space="preserve">.</w:t>
+        <w:t xml:space="preserve">testing Desolation Sound models against Clayoquot Sound nests.</w:t>
       </w:r>
     </w:p>
     <w:p>
@@ -313,7 +304,7 @@
         <w:pStyle w:val="BodyText"/>
       </w:pPr>
       <w:r>
-        <w:t xml:space="preserve">No study found in this review had built a laser-scan model from Clayoquot Sound nests, so whether a model built from local nests would outperform one borrowed from Desolation Sound was unknown. The provincial laser scans flown over Clayoquot Sound in 2019 and the public release of the radio-tracked nest locations</w:t>
+        <w:t xml:space="preserve">No study in this review had built a laser-scan model from Clayoquot Sound nests. The provincial scans flown there in 2019 and the public release of the nest locations</w:t>
       </w:r>
       <w:r>
         <w:t xml:space="preserve"> </w:t>
@@ -325,7 +316,7 @@
         <w:t xml:space="preserve"> </w:t>
       </w:r>
       <w:r>
-        <w:t xml:space="preserve">made the comparison possible. The objectives of this study were to (1) rebuild the two-measure model of Cosgrove et al.</w:t>
+        <w:t xml:space="preserve">made it possible to test whether a model built from local nests would outperform one transferred from Desolation Sound. The objectives of this study were to (1) rebuild the two-measure model of Cosgrove et al.</w:t>
       </w:r>
       <w:r>
         <w:t xml:space="preserve"> </w:t>
@@ -337,7 +328,7 @@
         <w:t xml:space="preserve"> </w:t>
       </w:r>
       <w:r>
-        <w:t xml:space="preserve">from Clayoquot Sound nests and open laser scans and score it on spatially separate groups of nests, and (2) compare that score with the score of the Desolation Sound model transferred to Clayoquot Sound. The expected direction of each measure and its source are given in</w:t>
+        <w:t xml:space="preserve">from Clayoquot Sound nests and open laser scans and score it on spatially separate groups of nests, and (2) compare that score with that of the Desolation Sound model transferred to Clayoquot Sound.</w:t>
       </w:r>
       <w:r>
         <w:t xml:space="preserve"> </w:t>
@@ -351,7 +342,10 @@
         </w:r>
       </w:hyperlink>
       <w:r>
-        <w:t xml:space="preserve">.</w:t>
+        <w:t xml:space="preserve"> </w:t>
+      </w:r>
+      <w:r>
+        <w:t xml:space="preserve">gives the expected direction of each measure and its source.</w:t>
       </w:r>
     </w:p>
     <w:tbl>
@@ -609,7 +603,7 @@
         <w:t xml:space="preserve">(Burger, 2001)</w:t>
       </w:r>
       <w:r>
-        <w:t xml:space="preserve">. The study area was the smallest convex polygon enclosing the nests, widened by 5 km.</w:t>
+        <w:t xml:space="preserve">. The study area was the smallest convex polygon around the nests, widened by 5 km.</w:t>
       </w:r>
     </w:p>
     <w:bookmarkEnd w:id="24"/>
@@ -627,7 +621,51 @@
         <w:pStyle w:val="FirstParagraph"/>
       </w:pPr>
       <w:r>
-        <w:t xml:space="preserve">The literature review followed a protocol fixed before the first search on 28 September 2026, with one question for each objective and a third asking whether the comparison had already been made. A curated reference library and Semantic Scholar were searched for Marbled Murrelet combined with airborne laser scanning or lidar, with habitat suitability, MaxEnt or transferability, and with Clayoquot Sound, and one round of backward and forward citation chasing was run from five central records. Records were retained if they were peer-reviewed articles, reviews, chapters, conference papers or agency reports that supplied a method, threshold or data product, were published in English from 1990 to 2026, and bore on laser-scan measures at nest sites, nesting-habitat models and their transfer, or nesting habitat in Clayoquot Sound. Of 157 records retrieved, 101 were unique, 70 were excluded on title and abstract and 31 were retained, of which 24 were read in full. The full text of 7 could not be reached, among them unpublished reports and a thesis from the 1990s and journal articles held behind paywalls. Records were screened and read, and every quotation taken from them was checked word for word against the source text by a script.</w:t>
+        <w:t xml:space="preserve">The literature review followed a protocol fixed on 28 September 2026, before the first search. A curated reference library and Semantic Scholar were searched for Marbled Murrelet with airborne laser scanning or lidar, with habitat suitability, MaxEnt or transferability, and with Clayoquot Sound. One round of backward and forward citation chasing was then run from five central records. Records were retained if they were</w:t>
+      </w:r>
+    </w:p>
+    <w:p>
+      <w:pPr>
+        <w:pStyle w:val="Compact"/>
+        <w:numPr>
+          <w:ilvl w:val="0"/>
+          <w:numId w:val="1001"/>
+        </w:numPr>
+      </w:pPr>
+      <w:r>
+        <w:t xml:space="preserve">peer-reviewed articles, reviews, chapters, conference papers or agency reports supplying a method, threshold or data product,</w:t>
+      </w:r>
+    </w:p>
+    <w:p>
+      <w:pPr>
+        <w:pStyle w:val="Compact"/>
+        <w:numPr>
+          <w:ilvl w:val="0"/>
+          <w:numId w:val="1001"/>
+        </w:numPr>
+      </w:pPr>
+      <w:r>
+        <w:t xml:space="preserve">published in English from 1990 to 2026, and</w:t>
+      </w:r>
+    </w:p>
+    <w:p>
+      <w:pPr>
+        <w:pStyle w:val="Compact"/>
+        <w:numPr>
+          <w:ilvl w:val="0"/>
+          <w:numId w:val="1001"/>
+        </w:numPr>
+      </w:pPr>
+      <w:r>
+        <w:t xml:space="preserve">concerned with laser-scan measures at nest sites, nesting-habitat models and their transfer, or nesting habitat in Clayoquot Sound.</w:t>
+      </w:r>
+    </w:p>
+    <w:p>
+      <w:pPr>
+        <w:pStyle w:val="FirstParagraph"/>
+      </w:pPr>
+      <w:r>
+        <w:t xml:space="preserve">Of 157 records retrieved, 101 were unique, 70 were excluded on title and abstract and 31 were retained, of which 24 were read in full. The other 7 could not be reached, among them unpublished reports and a thesis from the 1990s and journal articles behind paywalls. Every quotation taken from the records read was checked word for word against the source by a script.</w:t>
       </w:r>
     </w:p>
     <w:bookmarkEnd w:id="25"/>
@@ -645,7 +683,7 @@
         <w:pStyle w:val="FirstParagraph"/>
       </w:pPr>
       <w:r>
-        <w:t xml:space="preserve">Nests were located by radio-tracking Marbled Murrelets captured at sea</w:t>
+        <w:t xml:space="preserve">From 2000 to 2002, Marbled Murrelets captured at sea were radio-tracked to their nests in Clayoquot Sound</w:t>
       </w:r>
       <w:r>
         <w:t xml:space="preserve"> </w:t>
@@ -654,7 +692,7 @@
         <w:t xml:space="preserve">(Cosgrove et al., 2024)</w:t>
       </w:r>
       <w:r>
-        <w:t xml:space="preserve">, and the published data set for Clayoquot Sound held 36 ground-truthed nests found from 2000 to 2002, with a positional error of about 50 m</w:t>
+        <w:t xml:space="preserve">. The published data set listed 36 nests confirmed on the ground, with a positional error of about 50 m</w:t>
       </w:r>
       <w:r>
         <w:t xml:space="preserve"> </w:t>
@@ -681,7 +719,7 @@
         <w:pStyle w:val="FirstParagraph"/>
       </w:pPr>
       <w:r>
-        <w:t xml:space="preserve">Point clouds came from the 2019 Vancouver Island acquisition of LidarBC, the open lidar program of the Province of British Columbia. Of the 322 tiles whose centers lay inside the study area, the 29 tiles within 150 m of a nest and 40 tiles drawn at random from the rest were used. Nests outside the 2019 acquisition were not used, so that every cell came from a single acquisition. Points classed as noise or withheld were dropped, and each tile was thinned at random and then evened to 12 points per square meter in 10 m cells, so that point density did not differ between nest and background tiles.</w:t>
+        <w:t xml:space="preserve">Point clouds came from the 2019 Vancouver Island acquisition of LidarBC, the open lidar program of the Province of British Columbia, and only nests inside that acquisition were used. Of the 322 tiles centered in the study area, the 29 within 150 m of a nest and 40 drawn at random from the rest were used. Points classed as noise or withheld were dropped, and each tile was thinned at random and evened to 12 points per square meter in 10 m cells, so that point density did not differ between nest and background tiles.</w:t>
       </w:r>
     </w:p>
     <w:bookmarkEnd w:id="27"/>
@@ -805,7 +843,16 @@
         <w:pStyle w:val="FirstParagraph"/>
       </w:pPr>
       <w:r>
-        <w:t xml:space="preserve">Heights were normalized to the ground by a triangulated surface on ground points, points below 0 m or at or above 100 m were discarded, and five measures were computed in 100 m cells of 1 ha each</w:t>
+        <w:t xml:space="preserve">Heights were normalized to the ground by a triangulated surface on ground points, and points below 0 m or at or above 100 m were discarded. Following the grid and definitions of Cosgrove et al.</w:t>
+      </w:r>
+      <w:r>
+        <w:t xml:space="preserve"> </w:t>
+      </w:r>
+      <w:r>
+        <w:t xml:space="preserve">(2024)</w:t>
+      </w:r>
+      <w:r>
+        <w:t xml:space="preserve">, five measures were computed in 1 ha cells with lidR</w:t>
       </w:r>
       <w:r>
         <w:t xml:space="preserve"> </w:t>
@@ -814,16 +861,7 @@
         <w:t xml:space="preserve">(Roussel et al., 2020)</w:t>
       </w:r>
       <w:r>
-        <w:t xml:space="preserve">, following the grid and definitions of Cosgrove et al.</w:t>
-      </w:r>
-      <w:r>
-        <w:t xml:space="preserve"> </w:t>
-      </w:r>
-      <w:r>
-        <w:t xml:space="preserve">(2024)</w:t>
-      </w:r>
-      <w:r>
-        <w:t xml:space="preserve">. Forest vertical complexity was the standard deviation of point heights, and internal forest gaps were the number of empty 1 m³ voxels lying below the highest filled voxel of each 1 m column, summed over the cell. Forest height, the 95th percentile of point heights, canopy cover, the share of 1 m columns holding a point, and point density served only to define available forest.</w:t>
+        <w:t xml:space="preserve">. Forest vertical complexity was the standard deviation of point heights, and internal forest gaps were the number of empty 1 m³ voxels below the highest filled voxel of each 1 m column, summed over the cell. Forest height, the 95th percentile of point heights, canopy cover, the share of 1 m columns with a point, and point density were used only to define available forest.</w:t>
       </w:r>
     </w:p>
     <w:bookmarkEnd w:id="33"/>
@@ -841,7 +879,63 @@
         <w:pStyle w:val="FirstParagraph"/>
       </w:pPr>
       <w:r>
-        <w:t xml:space="preserve">A cell was treated as available forest where forest height was at least 20 m, canopy cover at least 90 percent and point density at least 10 points per square meter, and where no 30 m pixel inside it was harvested from 1998 to 2022. Nest cells were available-forest cells holding a nest, and background cells were all available-forest cells in the background tiles (</w:t>
+        <w:t xml:space="preserve">A cell was available forest if</w:t>
+      </w:r>
+    </w:p>
+    <w:p>
+      <w:pPr>
+        <w:pStyle w:val="Compact"/>
+        <w:numPr>
+          <w:ilvl w:val="0"/>
+          <w:numId w:val="1002"/>
+        </w:numPr>
+      </w:pPr>
+      <w:r>
+        <w:t xml:space="preserve">forest height was at least 20 m,</w:t>
+      </w:r>
+    </w:p>
+    <w:p>
+      <w:pPr>
+        <w:pStyle w:val="Compact"/>
+        <w:numPr>
+          <w:ilvl w:val="0"/>
+          <w:numId w:val="1002"/>
+        </w:numPr>
+      </w:pPr>
+      <w:r>
+        <w:t xml:space="preserve">canopy cover was at least 90 percent,</w:t>
+      </w:r>
+    </w:p>
+    <w:p>
+      <w:pPr>
+        <w:pStyle w:val="Compact"/>
+        <w:numPr>
+          <w:ilvl w:val="0"/>
+          <w:numId w:val="1002"/>
+        </w:numPr>
+      </w:pPr>
+      <w:r>
+        <w:t xml:space="preserve">point density was at least 10 points per square meter, and</w:t>
+      </w:r>
+    </w:p>
+    <w:p>
+      <w:pPr>
+        <w:pStyle w:val="Compact"/>
+        <w:numPr>
+          <w:ilvl w:val="0"/>
+          <w:numId w:val="1002"/>
+        </w:numPr>
+      </w:pPr>
+      <w:r>
+        <w:t xml:space="preserve">no 30 m pixel inside it was harvested from 1998 to 2022.</w:t>
+      </w:r>
+    </w:p>
+    <w:p>
+      <w:pPr>
+        <w:pStyle w:val="FirstParagraph"/>
+      </w:pPr>
+      <w:r>
+        <w:t xml:space="preserve">Nest cells were available-forest cells with a nest, and background cells were all available-forest cells in the background tiles (</w:t>
       </w:r>
       <w:hyperlink w:anchor="tbl-sample">
         <w:r>
@@ -852,7 +946,7 @@
         </w:r>
       </w:hyperlink>
       <w:r>
-        <w:t xml:space="preserve">). The nest sample was small, and the nests were located 17 to 19 years before the scans were flown.</w:t>
+        <w:t xml:space="preserve">). The nest sample was small, and the nests were found 17 to 19 years before the scans were flown.</w:t>
       </w:r>
     </w:p>
     <w:tbl>
@@ -1597,7 +1691,7 @@
         <w:t xml:space="preserve">(2024)</w:t>
       </w:r>
       <w:r>
-        <w:t xml:space="preserve">, MaxEnt was fitted to forest vertical complexity and internal forest gaps with linear and product features and a regularization multiplier of 0.2, using the maxnet package, which fits MaxEnt as a regularized generalized linear model</w:t>
+        <w:t xml:space="preserve">, MaxEnt was fitted to forest vertical complexity and internal forest gaps in the maxnet package</w:t>
       </w:r>
       <w:r>
         <w:t xml:space="preserve"> </w:t>
@@ -1606,7 +1700,7 @@
         <w:t xml:space="preserve">(Phillips et al., 2017)</w:t>
       </w:r>
       <w:r>
-        <w:t xml:space="preserve">, so the model was parametric. Predictions were taken on the complementary log-log scale. Cells were assigned to five folds by 10 km square blocks allocated at random</w:t>
+        <w:t xml:space="preserve">, with linear and product features and a regularization multiplier of 0.2. Predictions were taken on the complementary log-log scale. For spatial block cross-validation, cells were assigned to five folds by 10 km square blocks allocated at random</w:t>
       </w:r>
       <w:r>
         <w:t xml:space="preserve"> </w:t>
@@ -1615,7 +1709,7 @@
         <w:t xml:space="preserve">(Valavi et al., 2018)</w:t>
       </w:r>
       <w:r>
-        <w:t xml:space="preserve">, so that the nests of each fold lay apart from the nests that trained its model, and each fold was predicted by a model trained on the other four. For classification, each model’s threshold was the value that maximized the sum of sensitivity and specificity on its training cells</w:t>
+        <w:t xml:space="preserve">, and each fold was predicted by a model trained on the other four. Each model’s classification threshold maximized the sum of sensitivity, the share of nest cells classed as nesting habitat, and specificity, the share of background cells classed as not, on its training cells</w:t>
       </w:r>
       <w:r>
         <w:t xml:space="preserve"> </w:t>
@@ -1642,7 +1736,7 @@
         <w:pStyle w:val="FirstParagraph"/>
       </w:pPr>
       <w:r>
-        <w:t xml:space="preserve">The separability of nest and background cells on each measure was measured by the index</w:t>
+        <w:t xml:space="preserve">On each measure, the separability of nest and background cells was given by the index</w:t>
       </w:r>
       <w:r>
         <w:t xml:space="preserve"> </w:t>
@@ -1667,7 +1761,16 @@
         <w:t xml:space="preserve">(1994)</w:t>
       </w:r>
       <w:r>
-        <w:t xml:space="preserve">, the absolute difference of the two means divided by the sum of the two standard deviations, and tested with a Wilcoxon rank-sum test.</w:t>
+        <w:t xml:space="preserve">, the absolute difference between the two means divided by the sum of the two standard deviations. The difference was tested with a Wilcoxon rank-sum test, as in Cosgrove et al.</w:t>
+      </w:r>
+      <w:r>
+        <w:t xml:space="preserve"> </w:t>
+      </w:r>
+      <w:r>
+        <w:t xml:space="preserve">(2024)</w:t>
+      </w:r>
+      <w:r>
+        <w:t xml:space="preserve">.</w:t>
       </w:r>
     </w:p>
     <w:bookmarkEnd w:id="37"/>
@@ -1685,7 +1788,7 @@
         <w:pStyle w:val="FirstParagraph"/>
       </w:pPr>
       <w:r>
-        <w:t xml:space="preserve">Held-out predictions were pooled across folds and scored with the measures used by Murphy et al.</w:t>
+        <w:t xml:space="preserve">Held-out predictions were pooled across folds and scored with the measures of Murphy et al.</w:t>
       </w:r>
       <w:r>
         <w:t xml:space="preserve"> </w:t>
@@ -1694,7 +1797,7 @@
         <w:t xml:space="preserve">(2026)</w:t>
       </w:r>
       <w:r>
-        <w:t xml:space="preserve">. Discrimination was measured by AUC with a DeLong 95 percent confidence interval</w:t>
+        <w:t xml:space="preserve">. Discrimination was measured by AUC with a DeLong 95 percent confidence interval (CI)</w:t>
       </w:r>
       <w:r>
         <w:t xml:space="preserve"> </w:t>
@@ -1706,7 +1809,7 @@
         <w:t xml:space="preserve"> </w:t>
       </w:r>
       <w:r>
-        <w:t xml:space="preserve">and by the continuous Boyce index</w:t>
+        <w:t xml:space="preserve">and the continuous Boyce index</w:t>
       </w:r>
       <w:r>
         <w:t xml:space="preserve"> </w:t>
@@ -1715,7 +1818,7 @@
         <w:t xml:space="preserve">(Hirzel et al., 2006)</w:t>
       </w:r>
       <w:r>
-        <w:t xml:space="preserve">. Classification at each fold’s threshold was summarized by overall accuracy with an exact binomial interval, Cohen’s kappa, and the commission and omission error of each class. Agreement between prediction and the observed 0 or 1 outcome was measured by the coefficient of determination (</w:t>
+        <w:t xml:space="preserve">. Classification at each fold’s threshold was summarized by sensitivity, specificity, overall accuracy with an exact binomial interval, Cohen’s kappa and the commission and omission error of each class. Agreement between prediction and the observed 0 or 1 outcome was measured by root mean square error (RMSE), relative RMSE (RMSE over the mean outcome), mean absolute error, Brier score, the coefficient of determination (</w:t>
       </w:r>
       <w:r>
         <w:rPr>
@@ -1725,7 +1828,7 @@
         <w:t xml:space="preserve">R</w:t>
       </w:r>
       <w:r>
-        <w:t xml:space="preserve">²) of a linear regression of outcome on prediction with its</w:t>
+        <w:t xml:space="preserve">²) of outcome on prediction with its</w:t>
       </w:r>
       <w:r>
         <w:t xml:space="preserve"> </w:t>
@@ -1741,7 +1844,7 @@
         <w:t xml:space="preserve"> </w:t>
       </w:r>
       <w:r>
-        <w:t xml:space="preserve">test, root mean square error (RMSE), relative RMSE (RMSE over the mean outcome), mean absolute error, Brier score and Theil’s</w:t>
+        <w:t xml:space="preserve">test. Theil’s</w:t>
       </w:r>
       <w:r>
         <w:t xml:space="preserve"> </w:t>
@@ -1757,7 +1860,7 @@
         <w:t xml:space="preserve"> </w:t>
       </w:r>
       <w:r>
-        <w:t xml:space="preserve">bias, the share of squared error due to the difference between mean prediction and mean outcome. Overfitting was measured by the RMSE ratio, held-out RMSE over training RMSE, with a model rejected above 1.1</w:t>
+        <w:t xml:space="preserve">bias gave the share of squared error due to the gap between mean prediction and mean outcome. Overfitting was measured by the RMSE ratio, held-out over training RMSE, with a model rejected above 1.1</w:t>
       </w:r>
       <w:r>
         <w:t xml:space="preserve"> </w:t>
@@ -1766,7 +1869,7 @@
         <w:t xml:space="preserve">(Murphy et al., 2026)</w:t>
       </w:r>
       <w:r>
-        <w:t xml:space="preserve">. Residual autocorrelation was tested by Moran’s</w:t>
+        <w:t xml:space="preserve">, and residual autocorrelation by Moran’s</w:t>
       </w:r>
       <w:r>
         <w:t xml:space="preserve"> </w:t>
@@ -1782,7 +1885,7 @@
         <w:t xml:space="preserve"> </w:t>
       </w:r>
       <w:r>
-        <w:t xml:space="preserve">with inverse-distance weights and by the Durbin-Watson test on residuals ordered by easting. The Clayoquot Sound model was compared with the Desolation Sound model of Cosgrove et al.</w:t>
+        <w:t xml:space="preserve">with inverse-distance weights and the Durbin-Watson test on residuals ordered by easting. The model was compared with that of Cosgrove et al.</w:t>
       </w:r>
       <w:r>
         <w:t xml:space="preserve"> </w:t>
@@ -1791,10 +1894,7 @@
         <w:t xml:space="preserve">(2024)</w:t>
       </w:r>
       <w:r>
-        <w:t xml:space="preserve"> </w:t>
-      </w:r>
-      <w:r>
-        <w:t xml:space="preserve">in its own area and transferred to Clayoquot Sound on the two measures those authors reported, AUC and the Boyce index. Analyses were run in R 4.4.1</w:t>
+        <w:t xml:space="preserve">, in Desolation Sound and transferred to Clayoquot Sound, on the AUC and Boyce index those authors reported. Analyses were run in R 4.4.1</w:t>
       </w:r>
       <w:r>
         <w:t xml:space="preserve"> </w:t>
@@ -1806,7 +1906,7 @@
         <w:t xml:space="preserve"> </w:t>
       </w:r>
       <w:r>
-        <w:t xml:space="preserve">with lidR 4.2.3, maxnet 0.1.4, blockCV 3.2.0, pROC 1.19.0.1 and ecospat 4.1.3. Every chunk of the R code is held in the manuscript source and was run in the render that produced this document.</w:t>
+        <w:t xml:space="preserve">with lidR 4.2.3, maxnet 0.1.4, blockCV 3.2.0, pROC 1.19.0.1 and ecospat 4.1.3.</w:t>
       </w:r>
     </w:p>
     <w:bookmarkEnd w:id="38"/>
@@ -1834,7 +1934,7 @@
         <w:pStyle w:val="FirstParagraph"/>
       </w:pPr>
       <w:r>
-        <w:t xml:space="preserve">The 2019 scans covered 20 cells holding a nest, of which 16 were available forest, against 3,827 available-forest cells among the 7,869 scanned cells of the background tiles (</w:t>
+        <w:t xml:space="preserve">The 2019 scans covered 20 cells with a nest, of which 16 were available forest, against 3,827 available-forest cells among the 7,869 scanned cells of the background tiles (</w:t>
       </w:r>
       <w:hyperlink w:anchor="tbl-sample">
         <w:r>
@@ -2951,7 +3051,7 @@
         </w:r>
       </w:hyperlink>
       <w:r>
-        <w:t xml:space="preserve">). Its AUC was 0.53 (95 percent CI 0.39 to 0.67), against 0.77 for the Desolation Sound model in its own area and 0.63 for that model transferred to Clayoquot Sound, and its Boyce index was 0.10 against 0.99 and 0.67. At the training thresholds, 10 of 16 held-out nest cells and 2,264 of 3,827 background cells were classed as nesting habitat, so 62.5 percent of nest cells and 40.8 percent of background cells were classed correctly, an average accuracy of 51.7 percent. The omission error for nests was 0.38 and the commission error for nests 1.00, overall accuracy was 0.41 (95 percent CI 0.39 to 0.43) and kappa 0.00 (-0.03 to 0.03).</w:t>
+        <w:t xml:space="preserve">). Its AUC was 0.53 (95 percent CI 0.39 to 0.67), against 0.77 for the Desolation Sound model in its own area and 0.63 for that model transferred to Clayoquot Sound, and its Boyce index was 0.10 against 0.99 and 0.67. At the training thresholds, 10 of 16 held-out nest cells and 2,264 of 3,827 background cells were classed as nesting habitat, a sensitivity of 62.5 percent and a specificity of 40.8 percent, for an average accuracy of 51.7 percent. Cohen’s kappa, the agreement beyond chance, was 0.00 (95 percent CI -0.03 to 0.03).</w:t>
       </w:r>
     </w:p>
     <w:p>
@@ -2959,7 +3059,7 @@
         <w:pStyle w:val="BodyText"/>
       </w:pPr>
       <w:r>
-        <w:t xml:space="preserve">The model did not overfit, its RMSE ratio of 1.01 lying below the rejection line of 1.1. The RMSE was 0.61, the mean absolute error 0.60, the Brier score 0.37 and the relative RMSE 146, and Theil’s</w:t>
+        <w:t xml:space="preserve">The model did not overfit, its RMSE ratio of 1.01 lying below the rejection threshold of 1.1, but nearly all of its error was systematic [Theil’s</w:t>
       </w:r>
       <w:r>
         <w:t xml:space="preserve"> </w:t>
@@ -2975,30 +3075,23 @@
         <w:t xml:space="preserve"> </w:t>
       </w:r>
       <w:r>
-        <w:t xml:space="preserve">bias of 0.96 showed that nearly all of the error was systematic, because predictions averaged 0.60 while nest cells made up 0.004 of all cells. Predictions explained none of the variation in the outcome [</w:t>
+        <w:t xml:space="preserve">bias = 0.96], because predictions averaged 0.60 while nest cells made up 0.004 of all cells. Residuals were spatially autocorrelated [Moran’s</w:t>
+      </w:r>
+      <w:r>
+        <w:t xml:space="preserve"> </w:t>
       </w:r>
       <w:r>
         <w:rPr>
           <w:i/>
           <w:iCs/>
         </w:rPr>
-        <w:t xml:space="preserve">R</w:t>
-      </w:r>
-      <w:r>
-        <w:t xml:space="preserve">² = 0.00003,</w:t>
-      </w:r>
-      <w:r>
-        <w:t xml:space="preserve"> </w:t>
-      </w:r>
-      <w:r>
-        <w:rPr>
-          <w:i/>
-          <w:iCs/>
-        </w:rPr>
-        <w:t xml:space="preserve">F</w:t>
-      </w:r>
-      <w:r>
-        <w:t xml:space="preserve">(1, 3,841) = 0.13,</w:t>
+        <w:t xml:space="preserve">I</w:t>
+      </w:r>
+      <w:r>
+        <w:t xml:space="preserve"> </w:t>
+      </w:r>
+      <w:r>
+        <w:t xml:space="preserve">= 0.12,</w:t>
       </w:r>
       <w:r>
         <w:t xml:space="preserve"> </w:t>
@@ -3014,55 +3107,7 @@
         <w:t xml:space="preserve"> </w:t>
       </w:r>
       <w:r>
-        <w:t xml:space="preserve">= 0.72]. Residuals were spatially autocorrelated [Moran’s</w:t>
-      </w:r>
-      <w:r>
-        <w:t xml:space="preserve"> </w:t>
-      </w:r>
-      <w:r>
-        <w:rPr>
-          <w:i/>
-          <w:iCs/>
-        </w:rPr>
-        <w:t xml:space="preserve">I</w:t>
-      </w:r>
-      <w:r>
-        <w:t xml:space="preserve"> </w:t>
-      </w:r>
-      <w:r>
-        <w:t xml:space="preserve">= 0.12,</w:t>
-      </w:r>
-      <w:r>
-        <w:t xml:space="preserve"> </w:t>
-      </w:r>
-      <w:r>
-        <w:rPr>
-          <w:i/>
-          <w:iCs/>
-        </w:rPr>
-        <w:t xml:space="preserve">P</w:t>
-      </w:r>
-      <w:r>
-        <w:t xml:space="preserve"> </w:t>
-      </w:r>
-      <w:r>
-        <w:t xml:space="preserve">&lt; 0.001] but showed no serial correlation along easting [Durbin-Watson = 2.01,</w:t>
-      </w:r>
-      <w:r>
-        <w:t xml:space="preserve"> </w:t>
-      </w:r>
-      <w:r>
-        <w:rPr>
-          <w:i/>
-          <w:iCs/>
-        </w:rPr>
-        <w:t xml:space="preserve">P</w:t>
-      </w:r>
-      <w:r>
-        <w:t xml:space="preserve"> </w:t>
-      </w:r>
-      <w:r>
-        <w:t xml:space="preserve">= 0.60].</w:t>
+        <w:t xml:space="preserve">&lt; 0.001].</w:t>
       </w:r>
     </w:p>
     <w:tbl>
@@ -7099,7 +7144,7 @@
         <w:pStyle w:val="FirstParagraph"/>
       </w:pPr>
       <w:r>
-        <w:t xml:space="preserve">In Clayoquot Sound, a MaxEnt model rebuilt from 16 local nest cells and open 2019 laser scans ranked held-out nest cells above background cells no more often than chance, and its 95 percent interval on AUC took in both chance and the 0.63 reached by the same model transferred from Desolation Sound</w:t>
+        <w:t xml:space="preserve">In Clayoquot Sound, a MaxEnt model rebuilt from 16 local nest cells and open 2019 laser scans ranked held-out nest cells above background cells no more often than chance. The 95 percent interval on its AUC included both chance and the 0.63 reached by the same model transferred from Desolation Sound</w:t>
       </w:r>
       <w:r>
         <w:t xml:space="preserve"> </w:t>
@@ -7108,7 +7153,7 @@
         <w:t xml:space="preserve">(Cosgrove et al., 2024)</w:t>
       </w:r>
       <w:r>
-        <w:t xml:space="preserve">. The local model therefore did not outperform the borrowed one, and these data could not show that it did worse. In Oregon a locally selected lidar model also improved little on a transferred one, scoring 0.78 against 0.73</w:t>
+        <w:t xml:space="preserve">. The local model therefore did not outperform the transferred one, although these data could not show that it did worse. In Oregon, a locally selected lidar model also improved little on a transferred one, 0.78 against 0.73, but there the transferred model was already adequate on 772 surveyed stands</w:t>
       </w:r>
       <w:r>
         <w:t xml:space="preserve"> </w:t>
@@ -7117,7 +7162,7 @@
         <w:t xml:space="preserve">(Hagar et al., 2018)</w:t>
       </w:r>
       <w:r>
-        <w:t xml:space="preserve">, but there the transferred model was already adequate on 772 surveyed stands, whereas in Clayoquot Sound the local model had too few nests to learn from, and the Oregon local score may have been measured on the data it was fitted to.</w:t>
+        <w:t xml:space="preserve">.</w:t>
       </w:r>
     </w:p>
     <w:p>
@@ -7125,7 +7170,7 @@
         <w:pStyle w:val="BodyText"/>
       </w:pPr>
       <w:r>
-        <w:t xml:space="preserve">The two measures did not relate to nest sites in Clayoquot Sound as they did in Desolation Sound. Internal forest gaps were larger at nest cells than at background cells, the reverse of the negative relation in the Desolation Sound model</w:t>
+        <w:t xml:space="preserve">The two measures did not relate to nest sites in Clayoquot Sound as they did in Desolation Sound. Internal forest gaps were larger at nest cells than at background cells, the reverse of the Desolation Sound relation</w:t>
       </w:r>
       <w:r>
         <w:t xml:space="preserve"> </w:t>
@@ -7134,7 +7179,7 @@
         <w:t xml:space="preserve">(Cosgrove et al., 2024)</w:t>
       </w:r>
       <w:r>
-        <w:t xml:space="preserve">, and forest vertical complexity hardly differed. Ground plots at the same Clayoquot Sound nests found shorter and less varied canopy at nests than at random sites, while Desolation Sound nests stood in taller and more varied forest, and both relations differed significantly between the two areas</w:t>
+        <w:t xml:space="preserve">, and forest vertical complexity hardly differed. Ground plots at 27 Clayoquot Sound and 37 Desolation Sound nests also showed opposite relations, with shorter and less varied canopy than at random sites in Clayoquot Sound but taller and more varied canopy in Desolation Sound</w:t>
       </w:r>
       <w:r>
         <w:t xml:space="preserve"> </w:t>
@@ -7143,7 +7188,7 @@
         <w:t xml:space="preserve">(Silvergieter and Lank, 2011a)</w:t>
       </w:r>
       <w:r>
-        <w:t xml:space="preserve">. Nest trees in Clayoquot Sound also stood out less from the trees around them, being taller than available trees by 15 percent of their height against 30 percent in Desolation Sound</w:t>
+        <w:t xml:space="preserve">. Nest trees in Clayoquot Sound exceeded other available trees in height by an average of 15 percent of total height, against 30 percent in Desolation Sound</w:t>
       </w:r>
       <w:r>
         <w:t xml:space="preserve"> </w:t>
@@ -7172,13 +7217,13 @@
         <w:t xml:space="preserve"> </w:t>
       </w:r>
       <w:r>
-        <w:t xml:space="preserve">found aerial survey ranks failing in Clayoquot Sound for this reason, noting that Clayoquot Sound</w:t>
-      </w:r>
-      <w:r>
-        <w:t xml:space="preserve"> </w:t>
-      </w:r>
-      <w:r>
-        <w:t xml:space="preserve">“has experienced far less habitat loss from logging and has more uniform coverage of suitable forest (Zharikov et al. 2006); consequently a higher proportion of random points might fall within suitable nesting habitat, thereby minimizing the differences between nests and random points”</w:t>
+        <w:t xml:space="preserve">gave the same reason for the failure of aerial survey ranks in Clayoquot Sound, which</w:t>
+      </w:r>
+      <w:r>
+        <w:t xml:space="preserve"> </w:t>
+      </w:r>
+      <w:r>
+        <w:t xml:space="preserve">“has more uniform coverage of suitable forest (Zharikov et al. 2006); consequently a higher proportion of random points might fall within suitable nesting habitat, thereby minimizing the differences between nests and random points”</w:t>
       </w:r>
       <w:r>
         <w:t xml:space="preserve"> </w:t>
@@ -7187,7 +7232,7 @@
         <w:t xml:space="preserve">(Waterhouse et al., 2009, p. 90)</w:t>
       </w:r>
       <w:r>
-        <w:t xml:space="preserve">. The features that decided which stand a bird used may also have lain beyond a 1 ha summary of point heights. Silvergieter and Lank</w:t>
+        <w:t xml:space="preserve">. The features that decided which stand a bird used may also have gone unmeasured by a 1 ha summary of point heights. Silvergieter and Lank</w:t>
       </w:r>
       <w:r>
         <w:t xml:space="preserve"> </w:t>
@@ -7196,7 +7241,7 @@
         <w:t xml:space="preserve">(2011a)</w:t>
       </w:r>
       <w:r>
-        <w:t xml:space="preserve">, whose resource selection functions (RSF) at Clayoquot Sound relied on the density of platform trees, noted that</w:t>
+        <w:t xml:space="preserve">, who modeled nest-site selection with resource selection functions (RSF), noted that</w:t>
       </w:r>
       <w:r>
         <w:t xml:space="preserve"> </w:t>
@@ -7219,7 +7264,7 @@
         <w:pStyle w:val="BodyText"/>
       </w:pPr>
       <w:r>
-        <w:t xml:space="preserve">Sample size limited the comparison, because with 16 nest cells spread over five folds the 95 percent interval on AUC spanned 0.28, and because model residuals were spatially autocorrelated the cells were not independent, so the true uncertainty was likely wider still. Nest positions carried an error of about 50 m within 100 m cells</w:t>
+        <w:t xml:space="preserve">The small sample limited the comparison, because with 16 nest cells over five folds the 95 percent interval on AUC spanned 0.28, and spatially autocorrelated residuals meant that the cells were not independent, so the true uncertainty was probably wider. Nest positions had an error of about 50 m within 100 m cells</w:t>
       </w:r>
       <w:r>
         <w:t xml:space="preserve"> </w:t>
@@ -7228,7 +7273,7 @@
         <w:t xml:space="preserve">(Cooke et al., 2022)</w:t>
       </w:r>
       <w:r>
-        <w:t xml:space="preserve">, and the nests were located 17 to 19 years before the scans were flown, so although cells harvested from 1998 onward were removed, other change in the forest could not be measured. The model’s error was almost entirely systematic because MaxEnt output on the complementary log-log scale ranked relative suitability and was not scaled to the small share of nest cells in the sample, so the RMSE, Brier score and</w:t>
+        <w:t xml:space="preserve">, and forest change other than harvest in the 17 to 19 years between the nest searches and the scans could not be measured. The error was almost entirely systematic because MaxEnt output on the complementary log-log scale ranked relative suitability and was not scaled to the small share of nest cells, so the RMSE, Brier score and</w:t>
       </w:r>
       <w:r>
         <w:t xml:space="preserve"> </w:t>
@@ -7258,7 +7303,7 @@
         <w:t xml:space="preserve">(Burger et al., 2018)</w:t>
       </w:r>
       <w:r>
-        <w:t xml:space="preserve">, with a model fitted to the few local nests. Fitting one model to nests pooled across regions with terms for region, as Silvergieter and Lank</w:t>
+        <w:t xml:space="preserve">, with a model fitted to the few local nests. Two approaches might make better use of open scans than two stand-level measures, and both could be tested with data already public. One would be a model fitted to nests pooled across regions with terms for region, as Silvergieter and Lank</w:t>
       </w:r>
       <w:r>
         <w:t xml:space="preserve"> </w:t>
@@ -7270,7 +7315,7 @@
         <w:t xml:space="preserve"> </w:t>
       </w:r>
       <w:r>
-        <w:t xml:space="preserve">did with ground plots, or measuring individual tall trees from the scans, which formed the model of Lamphear et al.</w:t>
+        <w:t xml:space="preserve">fitted to ground plots, and the other would use measures of individual tall trees taken from the scans, the predictors of Lamphear et al.</w:t>
       </w:r>
       <w:r>
         <w:t xml:space="preserve"> </w:t>
@@ -7279,7 +7324,7 @@
         <w:t xml:space="preserve">(2025)</w:t>
       </w:r>
       <w:r>
-        <w:t xml:space="preserve">, might draw more from open scans than two stand-level measures, and both could be tested with data already public.</w:t>
+        <w:t xml:space="preserve">.</w:t>
       </w:r>
     </w:p>
     <w:bookmarkEnd w:id="50"/>
@@ -7315,7 +7360,7 @@
         <w:pStyle w:val="FirstParagraph"/>
       </w:pPr>
       <w:r>
-        <w:t xml:space="preserve">Every line of code that built, fitted and tested the model is held in the manuscript source at https://github.com/seamusrobertmurphy/lidar-marbled-murrelet. Nest locations are public under a CC0 license at the Movebank Data Repository</w:t>
+        <w:t xml:space="preserve">Every line of code that built, fitted and tested the model is in the manuscript source at https://github.com/seamusrobertmurphy/lidar-marbled-murrelet. Nest locations are public under a CC0 license at the Movebank Data Repository</w:t>
       </w:r>
       <w:r>
         <w:t xml:space="preserve"> </w:t>
@@ -11201,6 +11246,91 @@
     <w:lvl w:ilvl="8">
       <w:numFmt w:val="bullet"/>
       <w:lvlText w:val=" "/>
+      <w:lvlJc w:val="left"/>
+      <w:pPr>
+        <w:ind w:left="6480" w:hanging="360"/>
+      </w:pPr>
+    </w:lvl>
+  </w:abstractNum>
+  <w:abstractNum w:abstractNumId="99411">
+    <w:nsid w:val="00A99411"/>
+    <w:multiLevelType w:val="multilevel"/>
+    <w:lvl w:ilvl="0">
+      <w:start w:val="1"/>
+      <w:numFmt w:val="decimal"/>
+      <w:lvlText w:val="%1."/>
+      <w:lvlJc w:val="left"/>
+      <w:pPr>
+        <w:ind w:left="720" w:hanging="360"/>
+      </w:pPr>
+    </w:lvl>
+    <w:lvl w:ilvl="1">
+      <w:start w:val="1"/>
+      <w:numFmt w:val="decimal"/>
+      <w:lvlText w:val="%2."/>
+      <w:lvlJc w:val="left"/>
+      <w:pPr>
+        <w:ind w:left="1440" w:hanging="360"/>
+      </w:pPr>
+    </w:lvl>
+    <w:lvl w:ilvl="2">
+      <w:start w:val="1"/>
+      <w:numFmt w:val="decimal"/>
+      <w:lvlText w:val="%3."/>
+      <w:lvlJc w:val="left"/>
+      <w:pPr>
+        <w:ind w:left="2160" w:hanging="360"/>
+      </w:pPr>
+    </w:lvl>
+    <w:lvl w:ilvl="3">
+      <w:start w:val="1"/>
+      <w:numFmt w:val="decimal"/>
+      <w:lvlText w:val="%4."/>
+      <w:lvlJc w:val="left"/>
+      <w:pPr>
+        <w:ind w:left="2880" w:hanging="360"/>
+      </w:pPr>
+    </w:lvl>
+    <w:lvl w:ilvl="4">
+      <w:start w:val="1"/>
+      <w:numFmt w:val="decimal"/>
+      <w:lvlText w:val="%5."/>
+      <w:lvlJc w:val="left"/>
+      <w:pPr>
+        <w:ind w:left="3600" w:hanging="360"/>
+      </w:pPr>
+    </w:lvl>
+    <w:lvl w:ilvl="5">
+      <w:start w:val="1"/>
+      <w:numFmt w:val="decimal"/>
+      <w:lvlText w:val="%6."/>
+      <w:lvlJc w:val="left"/>
+      <w:pPr>
+        <w:ind w:left="4320" w:hanging="360"/>
+      </w:pPr>
+    </w:lvl>
+    <w:lvl w:ilvl="6">
+      <w:start w:val="1"/>
+      <w:numFmt w:val="decimal"/>
+      <w:lvlText w:val="%7."/>
+      <w:lvlJc w:val="left"/>
+      <w:pPr>
+        <w:ind w:left="5040" w:hanging="360"/>
+      </w:pPr>
+    </w:lvl>
+    <w:lvl w:ilvl="7">
+      <w:start w:val="1"/>
+      <w:numFmt w:val="decimal"/>
+      <w:lvlText w:val="%8."/>
+      <w:lvlJc w:val="left"/>
+      <w:pPr>
+        <w:ind w:left="5760" w:hanging="360"/>
+      </w:pPr>
+    </w:lvl>
+    <w:lvl w:ilvl="8">
+      <w:start w:val="1"/>
+      <w:numFmt w:val="decimal"/>
+      <w:lvlText w:val="%9."/>
       <w:lvlJc w:val="left"/>
       <w:pPr>
         <w:ind w:left="6480" w:hanging="360"/>
@@ -11284,6 +11414,66 @@
   </w:num>
   <w:num w:numId="1000">
     <w:abstractNumId w:val="990"/>
+  </w:num>
+  <w:num w:numId="1001">
+    <w:abstractNumId w:val="99411"/>
+    <w:lvlOverride w:ilvl="0">
+      <w:startOverride w:val="1"/>
+    </w:lvlOverride>
+    <w:lvlOverride w:ilvl="1">
+      <w:startOverride w:val="1"/>
+    </w:lvlOverride>
+    <w:lvlOverride w:ilvl="2">
+      <w:startOverride w:val="1"/>
+    </w:lvlOverride>
+    <w:lvlOverride w:ilvl="3">
+      <w:startOverride w:val="1"/>
+    </w:lvlOverride>
+    <w:lvlOverride w:ilvl="4">
+      <w:startOverride w:val="1"/>
+    </w:lvlOverride>
+    <w:lvlOverride w:ilvl="5">
+      <w:startOverride w:val="1"/>
+    </w:lvlOverride>
+    <w:lvlOverride w:ilvl="6">
+      <w:startOverride w:val="1"/>
+    </w:lvlOverride>
+    <w:lvlOverride w:ilvl="7">
+      <w:startOverride w:val="1"/>
+    </w:lvlOverride>
+    <w:lvlOverride w:ilvl="8">
+      <w:startOverride w:val="1"/>
+    </w:lvlOverride>
+  </w:num>
+  <w:num w:numId="1002">
+    <w:abstractNumId w:val="99411"/>
+    <w:lvlOverride w:ilvl="0">
+      <w:startOverride w:val="1"/>
+    </w:lvlOverride>
+    <w:lvlOverride w:ilvl="1">
+      <w:startOverride w:val="1"/>
+    </w:lvlOverride>
+    <w:lvlOverride w:ilvl="2">
+      <w:startOverride w:val="1"/>
+    </w:lvlOverride>
+    <w:lvlOverride w:ilvl="3">
+      <w:startOverride w:val="1"/>
+    </w:lvlOverride>
+    <w:lvlOverride w:ilvl="4">
+      <w:startOverride w:val="1"/>
+    </w:lvlOverride>
+    <w:lvlOverride w:ilvl="5">
+      <w:startOverride w:val="1"/>
+    </w:lvlOverride>
+    <w:lvlOverride w:ilvl="6">
+      <w:startOverride w:val="1"/>
+    </w:lvlOverride>
+    <w:lvlOverride w:ilvl="7">
+      <w:startOverride w:val="1"/>
+    </w:lvlOverride>
+    <w:lvlOverride w:ilvl="8">
+      <w:startOverride w:val="1"/>
+    </w:lvlOverride>
   </w:num>
 </w:numbering>
 </file>

</xml_diff>